<commit_message>
test: add tests and warnings for empty or oversized converted documents
</commit_message>
<xml_diff>
--- a/src/indexer/__tests__/fixtures/spec.docx
+++ b/src/indexer/__tests__/fixtures/spec.docx
@@ -72,7 +72,83 @@
           </w:p>
         </w:tc>
       </w:tr>
+      <w:tr>
+        <w:tc>
+          <w:p>
+            <w:r>
+              <w:t xml:space="preserve">Store credit | voucher</w:t>
+            </w:r>
+          </w:p>
+        </w:tc>
+        <w:tc>
+          <w:p>
+            <w:r>
+              <w:t xml:space="preserve">Automatic</w:t>
+            </w:r>
+          </w:p>
+        </w:tc>
+      </w:tr>
     </w:tbl>
+    <w:p>
+      <w:pPr>
+        <w:pStyle w:val="Heading2"/>
+      </w:pPr>
+      <w:r>
+        <w:t xml:space="preserve">Eligibility</w:t>
+      </w:r>
+    </w:p>
+    <w:p>
+      <w:pPr>
+        <w:numPr>
+          <w:ilvl w:val="0"/>
+          <w:numId w:val="1"/>
+        </w:numPr>
+      </w:pPr>
+      <w:r>
+        <w:t xml:space="preserve">Requested within 30 days of delivery</w:t>
+      </w:r>
+    </w:p>
+    <w:p>
+      <w:pPr>
+        <w:numPr>
+          <w:ilvl w:val="0"/>
+          <w:numId w:val="1"/>
+        </w:numPr>
+      </w:pPr>
+      <w:r>
+        <w:t xml:space="preserve">Digital goods only if not downloaded</w:t>
+      </w:r>
+    </w:p>
+    <w:p>
+      <w:pPr>
+        <w:pStyle w:val="Heading2"/>
+      </w:pPr>
+      <w:r>
+        <w:t xml:space="preserve">Process</w:t>
+      </w:r>
+    </w:p>
+    <w:p>
+      <w:pPr>
+        <w:numPr>
+          <w:ilvl w:val="0"/>
+          <w:numId w:val="2"/>
+        </w:numPr>
+      </w:pPr>
+      <w:r>
+        <w:t xml:space="preserve">Check eligibility</w:t>
+      </w:r>
+    </w:p>
+    <w:p>
+      <w:pPr>
+        <w:numPr>
+          <w:ilvl w:val="0"/>
+          <w:numId w:val="2"/>
+        </w:numPr>
+      </w:pPr>
+      <w:r>
+        <w:t xml:space="preserve">Approve or reject</w:t>
+      </w:r>
+    </w:p>
     <w:p>
       <w:pPr>
         <w:pStyle w:val="Heading2"/>
@@ -88,6 +164,31 @@
     </w:p>
   </w:body>
 </w:document>
+</file>
+
+<file path=word/numbering.xml><?xml version="1.0" encoding="utf-8"?>
+<w:numbering xmlns:w="http://schemas.openxmlformats.org/wordprocessingml/2006/main">
+  <w:abstractNum w:abstractNumId="0">
+    <w:lvl w:ilvl="0">
+      <w:start w:val="1"/>
+      <w:numFmt w:val="bullet"/>
+      <w:lvlText w:val="•"/>
+    </w:lvl>
+  </w:abstractNum>
+  <w:abstractNum w:abstractNumId="1">
+    <w:lvl w:ilvl="0">
+      <w:start w:val="1"/>
+      <w:numFmt w:val="decimal"/>
+      <w:lvlText w:val="%1."/>
+    </w:lvl>
+  </w:abstractNum>
+  <w:num w:numId="1">
+    <w:abstractNumId w:val="0"/>
+  </w:num>
+  <w:num w:numId="2">
+    <w:abstractNumId w:val="1"/>
+  </w:num>
+</w:numbering>
 </file>
 
 <file path=word/styles.xml><?xml version="1.0" encoding="utf-8"?>

</xml_diff>